<commit_message>
Add XRD support and refine GUI workflow
</commit_message>
<xml_diff>
--- a/src/si_generator/templates/SI_template.docx
+++ b/src/si_generator/templates/SI_template.docx
@@ -696,6 +696,51 @@
       <w:pPr>
         <w:spacing w:before="0" w:after="0" w:line="240" w:lineRule="auto"/>
         <w:ind w:firstLine="0"/>
+        <w:jc w:val="both"/>
+      </w:pPr>
+      <w:r>
+        <w:rPr>
+          <w:rFonts w:ascii="Times New Roman" w:hAnsi="Times New Roman" w:eastAsia="Times New Roman"/>
+          <w:b/>
+          <w:sz w:val="28"/>
+        </w:rPr>
+        <w:t>{xrd.text}</w:t>
+      </w:r>
+      <w:r>
+        <w:rPr>
+          <w:rFonts w:ascii="Times New Roman" w:hAnsi="Times New Roman" w:eastAsia="Times New Roman"/>
+          <w:sz w:val="28"/>
+        </w:rPr>
+      </w:r>
+      <w:r>
+        <w:rPr>
+          <w:rFonts w:ascii="Times New Roman" w:hAnsi="Times New Roman" w:eastAsia="Times New Roman"/>
+          <w:sz w:val="28"/>
+        </w:rPr>
+      </w:r>
+      <w:r>
+        <w:rPr>
+          <w:rFonts w:ascii="Times New Roman" w:hAnsi="Times New Roman" w:eastAsia="Times New Roman"/>
+          <w:sz w:val="28"/>
+        </w:rPr>
+      </w:r>
+      <w:r>
+        <w:rPr>
+          <w:rFonts w:ascii="Times New Roman" w:hAnsi="Times New Roman" w:eastAsia="Times New Roman"/>
+          <w:sz w:val="28"/>
+        </w:rPr>
+      </w:r>
+      <w:r>
+        <w:rPr>
+          <w:rFonts w:ascii="Times New Roman" w:hAnsi="Times New Roman" w:eastAsia="Times New Roman"/>
+          <w:sz w:val="28"/>
+        </w:rPr>
+      </w:r>
+    </w:p>
+    <w:p>
+      <w:pPr>
+        <w:spacing w:before="0" w:after="0" w:line="240" w:lineRule="auto"/>
+        <w:ind w:firstLine="0"/>
         <w:jc w:val="left"/>
       </w:pPr>
       <w:r>

</xml_diff>